<commit_message>
Update JCPV System Documentation.docx
</commit_message>
<xml_diff>
--- a/JCPV System Documentation.docx
+++ b/JCPV System Documentation.docx
@@ -23,11 +23,8 @@
       </w:r>
     </w:p>
     <w:p>
-      <w:pPr>
-        <w:spacing w:after="120"/>
-      </w:pPr>
       <w:r>
-        <w:t xml:space="preserve">Created by students of </w:t>
+        <w:t xml:space="preserve">This project was developed by students of </w:t>
       </w:r>
       <w:proofErr w:type="spellStart"/>
       <w:r>
@@ -35,31 +32,79 @@
       </w:r>
       <w:proofErr w:type="spellEnd"/>
       <w:r>
-        <w:t xml:space="preserve"> University Clarion for Jefferson County</w:t>
+        <w:t xml:space="preserve"> University Clarion in collaboration with Jefferson County, Pennsylvania. It supports county‑level property review, blight mitigation, and geospatial visualization through a custom‑built Windows application.</w:t>
       </w:r>
     </w:p>
     <w:p>
       <w:pPr>
-        <w:spacing w:after="120"/>
+        <w:pStyle w:val="Heading2"/>
       </w:pPr>
       <w:r>
-        <w:t>[Project context]</w:t>
+        <w:t>Project Context</w:t>
       </w:r>
     </w:p>
     <w:p>
       <w:pPr>
-        <w:spacing w:after="120"/>
+        <w:rPr>
+          <w:color w:val="FF0000"/>
+        </w:rPr>
       </w:pPr>
       <w:r>
-        <w:t>[Problem summary]</w:t>
+        <w:rPr>
+          <w:color w:val="FF0000"/>
+        </w:rPr>
+        <w:t>(Describe the origin of the project, the client’s needs, and the broader problem space. For example: county blight tracking, data consolidation challenges, or the need for a user‑friendly mapping tool.)</w:t>
       </w:r>
     </w:p>
     <w:p>
       <w:pPr>
-        <w:spacing w:after="120"/>
+        <w:pStyle w:val="Heading2"/>
       </w:pPr>
       <w:r>
-        <w:t>[High-level solution summary]</w:t>
+        <w:t>Problem Summary</w:t>
+      </w:r>
+    </w:p>
+    <w:p>
+      <w:pPr>
+        <w:rPr>
+          <w:color w:val="FF0000"/>
+        </w:rPr>
+      </w:pPr>
+      <w:r>
+        <w:rPr>
+          <w:color w:val="FF0000"/>
+        </w:rPr>
+        <w:t>(Summarize the specific issues the project aims to solve — e.g., inconsistent property data, lack of centralized mapping, manual workflows, etc.)</w:t>
+      </w:r>
+    </w:p>
+    <w:p>
+      <w:pPr>
+        <w:pStyle w:val="Heading2"/>
+      </w:pPr>
+      <w:r>
+        <w:t>High</w:t>
+      </w:r>
+      <w:r>
+        <w:rPr>
+          <w:rFonts w:ascii="Cambria Math" w:hAnsi="Cambria Math" w:cs="Cambria Math"/>
+        </w:rPr>
+        <w:t>‑</w:t>
+      </w:r>
+      <w:r>
+        <w:t>Level Solution Summary</w:t>
+      </w:r>
+    </w:p>
+    <w:p>
+      <w:pPr>
+        <w:rPr>
+          <w:color w:val="FF0000"/>
+        </w:rPr>
+      </w:pPr>
+      <w:r>
+        <w:rPr>
+          <w:color w:val="FF0000"/>
+        </w:rPr>
+        <w:t>(Describe the JCPV system at a high level: a standalone Windows application, CSV‑driven data model, integrated mapping, geocoding, and visualization.)</w:t>
       </w:r>
     </w:p>
     <w:p>
@@ -104,26 +149,117 @@
     </w:p>
     <w:p>
       <w:pPr>
-        <w:spacing w:after="120"/>
+        <w:pStyle w:val="Heading2"/>
       </w:pPr>
       <w:r>
-        <w:t>[Key design choices]</w:t>
+        <w:t>Key Design Choices</w:t>
       </w:r>
     </w:p>
     <w:p>
       <w:pPr>
-        <w:spacing w:after="120"/>
+        <w:pStyle w:val="ListParagraph"/>
+        <w:numPr>
+          <w:ilvl w:val="0"/>
+          <w:numId w:val="11"/>
+        </w:numPr>
+        <w:rPr>
+          <w:color w:val="FF0000"/>
+        </w:rPr>
       </w:pPr>
       <w:r>
-        <w:t>[Limitations or excluded features]</w:t>
+        <w:rPr>
+          <w:color w:val="FF0000"/>
+        </w:rPr>
+        <w:t>(Example: Using CSV instead of a database for portability and simplicity.)</w:t>
       </w:r>
     </w:p>
     <w:p>
       <w:pPr>
-        <w:spacing w:after="120"/>
+        <w:pStyle w:val="ListParagraph"/>
+        <w:numPr>
+          <w:ilvl w:val="0"/>
+          <w:numId w:val="11"/>
+        </w:numPr>
+        <w:rPr>
+          <w:color w:val="FF0000"/>
+        </w:rPr>
       </w:pPr>
       <w:r>
-        <w:t>[Reasons for decisions]</w:t>
+        <w:rPr>
+          <w:color w:val="FF0000"/>
+        </w:rPr>
+        <w:t>(Example: Bundling Chromium instead of relying on Selenium or external browsers.)</w:t>
+      </w:r>
+    </w:p>
+    <w:p>
+      <w:pPr>
+        <w:pStyle w:val="ListParagraph"/>
+        <w:numPr>
+          <w:ilvl w:val="0"/>
+          <w:numId w:val="11"/>
+        </w:numPr>
+        <w:rPr>
+          <w:color w:val="FF0000"/>
+        </w:rPr>
+      </w:pPr>
+      <w:r>
+        <w:rPr>
+          <w:color w:val="FF0000"/>
+        </w:rPr>
+        <w:t>(Example: Using Folium + offline tiles for consistent map rendering.)</w:t>
+      </w:r>
+    </w:p>
+    <w:p>
+      <w:pPr>
+        <w:pStyle w:val="Heading2"/>
+      </w:pPr>
+      <w:r>
+        <w:t>Limitations or Excluded Features</w:t>
+      </w:r>
+    </w:p>
+    <w:p>
+      <w:pPr>
+        <w:pStyle w:val="ListParagraph"/>
+        <w:numPr>
+          <w:ilvl w:val="0"/>
+          <w:numId w:val="11"/>
+        </w:numPr>
+        <w:rPr>
+          <w:color w:val="FF0000"/>
+        </w:rPr>
+      </w:pPr>
+      <w:r>
+        <w:rPr>
+          <w:color w:val="FF0000"/>
+        </w:rPr>
+        <w:t>(Example: No real‑time syncing, no multi‑user editing, no cloud storage.)</w:t>
+      </w:r>
+    </w:p>
+    <w:p>
+      <w:pPr>
+        <w:pStyle w:val="Heading2"/>
+      </w:pPr>
+      <w:r>
+        <w:lastRenderedPageBreak/>
+        <w:t>Reasons for Decisions</w:t>
+      </w:r>
+    </w:p>
+    <w:p>
+      <w:pPr>
+        <w:pStyle w:val="ListParagraph"/>
+        <w:numPr>
+          <w:ilvl w:val="0"/>
+          <w:numId w:val="11"/>
+        </w:numPr>
+        <w:rPr>
+          <w:color w:val="FF0000"/>
+        </w:rPr>
+      </w:pPr>
+      <w:r>
+        <w:rPr>
+          <w:color w:val="FF0000"/>
+        </w:rPr>
+        <w:t>(Explain constraints: time, client needs, offline requirements, maintainability.)</w:t>
       </w:r>
     </w:p>
     <w:p>
@@ -136,34 +272,135 @@
     </w:p>
     <w:p>
       <w:pPr>
-        <w:spacing w:after="120"/>
+        <w:pStyle w:val="Heading2"/>
       </w:pPr>
       <w:r>
-        <w:t>[Week-by-week or phase-by-phase summary]</w:t>
+        <w:t>Week</w:t>
+      </w:r>
+      <w:r>
+        <w:rPr>
+          <w:rFonts w:ascii="Cambria Math" w:hAnsi="Cambria Math" w:cs="Cambria Math"/>
+        </w:rPr>
+        <w:t>‑</w:t>
+      </w:r>
+      <w:r>
+        <w:t>by</w:t>
+      </w:r>
+      <w:r>
+        <w:rPr>
+          <w:rFonts w:ascii="Cambria Math" w:hAnsi="Cambria Math" w:cs="Cambria Math"/>
+        </w:rPr>
+        <w:t>‑</w:t>
+      </w:r>
+      <w:r>
+        <w:t>Week Summary</w:t>
       </w:r>
     </w:p>
     <w:p>
       <w:pPr>
-        <w:spacing w:after="120"/>
+        <w:rPr>
+          <w:color w:val="FF0000"/>
+        </w:rPr>
       </w:pPr>
       <w:r>
-        <w:t>[Major milestones]</w:t>
+        <w:rPr>
+          <w:color w:val="FF0000"/>
+        </w:rPr>
+        <w:t>(Summaries of each development period — you already have these logs.)</w:t>
       </w:r>
     </w:p>
     <w:p>
       <w:pPr>
-        <w:spacing w:after="120"/>
+        <w:pStyle w:val="Heading2"/>
       </w:pPr>
       <w:r>
-        <w:t>[Client meetings]</w:t>
+        <w:t>Major Milestones</w:t>
       </w:r>
     </w:p>
     <w:p>
       <w:pPr>
-        <w:spacing w:after="120"/>
+        <w:pStyle w:val="ListParagraph"/>
+        <w:numPr>
+          <w:ilvl w:val="0"/>
+          <w:numId w:val="11"/>
+        </w:numPr>
+        <w:rPr>
+          <w:color w:val="FF0000"/>
+        </w:rPr>
       </w:pPr>
       <w:r>
-        <w:t>[Technical hurdles]</w:t>
+        <w:rPr>
+          <w:color w:val="FF0000"/>
+        </w:rPr>
+        <w:t>(Prototype completion, mapping subsystem, UI overhaul, packaging, client demos.)</w:t>
+      </w:r>
+    </w:p>
+    <w:p>
+      <w:pPr>
+        <w:pStyle w:val="Heading2"/>
+      </w:pPr>
+      <w:r>
+        <w:t>Client Meetings</w:t>
+      </w:r>
+    </w:p>
+    <w:p>
+      <w:pPr>
+        <w:pStyle w:val="ListParagraph"/>
+        <w:numPr>
+          <w:ilvl w:val="0"/>
+          <w:numId w:val="11"/>
+        </w:numPr>
+        <w:rPr>
+          <w:color w:val="FF0000"/>
+        </w:rPr>
+      </w:pPr>
+      <w:r>
+        <w:rPr>
+          <w:color w:val="FF0000"/>
+        </w:rPr>
+        <w:t>(Dates, goals, outcomes.)</w:t>
+      </w:r>
+    </w:p>
+    <w:p>
+      <w:pPr>
+        <w:pStyle w:val="Heading2"/>
+      </w:pPr>
+      <w:r>
+        <w:t>Technical Hurdles</w:t>
+      </w:r>
+    </w:p>
+    <w:p>
+      <w:pPr>
+        <w:pStyle w:val="ListParagraph"/>
+        <w:numPr>
+          <w:ilvl w:val="0"/>
+          <w:numId w:val="11"/>
+        </w:numPr>
+        <w:rPr>
+          <w:b/>
+          <w:bCs/>
+          <w:color w:val="FF0000"/>
+        </w:rPr>
+      </w:pPr>
+      <w:r>
+        <w:rPr>
+          <w:color w:val="FF0000"/>
+        </w:rPr>
+        <w:t xml:space="preserve">(Examples: geocoding rate limits, shapefile issues, </w:t>
+      </w:r>
+      <w:proofErr w:type="spellStart"/>
+      <w:r>
+        <w:rPr>
+          <w:color w:val="FF0000"/>
+        </w:rPr>
+        <w:t>Tkinter</w:t>
+      </w:r>
+      <w:proofErr w:type="spellEnd"/>
+      <w:r>
+        <w:rPr>
+          <w:color w:val="FF0000"/>
+        </w:rPr>
+        <w:t xml:space="preserve"> resizing, Chromium bundling.)</w:t>
       </w:r>
     </w:p>
     <w:p>
@@ -176,42 +413,90 @@
     </w:p>
     <w:p>
       <w:pPr>
-        <w:spacing w:after="120"/>
+        <w:pStyle w:val="Heading2"/>
       </w:pPr>
       <w:r>
-        <w:t>[Unexpected delays]</w:t>
+        <w:t>Unexpected Delays</w:t>
       </w:r>
     </w:p>
     <w:p>
       <w:pPr>
+        <w:pStyle w:val="ListParagraph"/>
+        <w:numPr>
+          <w:ilvl w:val="0"/>
+          <w:numId w:val="11"/>
+        </w:numPr>
         <w:spacing w:after="120"/>
+        <w:rPr>
+          <w:color w:val="FF0000"/>
+        </w:rPr>
       </w:pPr>
       <w:r>
-        <w:t>[Tasks completed faster than expected]</w:t>
+        <w:rPr>
+          <w:color w:val="FF0000"/>
+        </w:rPr>
+        <w:t>(Example: debugging map rendering, CSV formatting inconsistencies, packaging issues.)</w:t>
       </w:r>
     </w:p>
     <w:p>
       <w:pPr>
-        <w:spacing w:after="120"/>
+        <w:pStyle w:val="Heading2"/>
       </w:pPr>
       <w:r>
-        <w:t>[</w:t>
-      </w:r>
-      <w:proofErr w:type="gramStart"/>
-      <w:r>
-        <w:t>Dependencies</w:t>
-      </w:r>
-      <w:proofErr w:type="gramEnd"/>
-      <w:r>
-        <w:t xml:space="preserve"> that affected progress]</w:t>
+        <w:t>Tasks Completed Faster Than Expected</w:t>
       </w:r>
     </w:p>
     <w:p>
       <w:pPr>
+        <w:pStyle w:val="ListParagraph"/>
+        <w:numPr>
+          <w:ilvl w:val="0"/>
+          <w:numId w:val="11"/>
+        </w:numPr>
+        <w:spacing w:after="120"/>
+        <w:rPr>
+          <w:color w:val="FF0000"/>
+        </w:rPr>
+      </w:pPr>
+      <w:r>
+        <w:rPr>
+          <w:color w:val="FF0000"/>
+        </w:rPr>
+        <w:t>(Example: implementing filters, integrating offline tiles.)</w:t>
+      </w:r>
+    </w:p>
+    <w:p>
+      <w:pPr>
+        <w:pStyle w:val="Heading2"/>
+      </w:pPr>
+      <w:r>
+        <w:t>Dependencies That Affected Progress</w:t>
+      </w:r>
+    </w:p>
+    <w:p>
+      <w:pPr>
+        <w:pStyle w:val="ListParagraph"/>
+        <w:numPr>
+          <w:ilvl w:val="0"/>
+          <w:numId w:val="11"/>
+        </w:numPr>
+        <w:spacing w:after="120"/>
+        <w:rPr>
+          <w:color w:val="FF0000"/>
+        </w:rPr>
+      </w:pPr>
+      <w:r>
+        <w:rPr>
+          <w:color w:val="FF0000"/>
+        </w:rPr>
+        <w:t>(Example: geocoding API limits, shapefile availability, Windows security restrictions.)</w:t>
+      </w:r>
+    </w:p>
+    <w:p>
+      <w:pPr>
         <w:pStyle w:val="Heading1"/>
       </w:pPr>
       <w:r>
-        <w:lastRenderedPageBreak/>
         <w:t>Anticipated Information Flow &amp; Cycles</w:t>
       </w:r>
     </w:p>
@@ -241,10 +526,68 @@
     </w:p>
     <w:p>
       <w:pPr>
+        <w:pStyle w:val="ListParagraph"/>
+        <w:numPr>
+          <w:ilvl w:val="0"/>
+          <w:numId w:val="11"/>
+        </w:numPr>
         <w:spacing w:after="120"/>
       </w:pPr>
       <w:r>
-        <w:t>[Recurring tasks or workflows]</w:t>
+        <w:t>Loading CSV</w:t>
+      </w:r>
+    </w:p>
+    <w:p>
+      <w:pPr>
+        <w:pStyle w:val="ListParagraph"/>
+        <w:numPr>
+          <w:ilvl w:val="0"/>
+          <w:numId w:val="11"/>
+        </w:numPr>
+        <w:spacing w:after="120"/>
+      </w:pPr>
+      <w:r>
+        <w:t>Filtering and reviewing data</w:t>
+      </w:r>
+    </w:p>
+    <w:p>
+      <w:pPr>
+        <w:pStyle w:val="ListParagraph"/>
+        <w:numPr>
+          <w:ilvl w:val="0"/>
+          <w:numId w:val="11"/>
+        </w:numPr>
+        <w:spacing w:after="120"/>
+      </w:pPr>
+      <w:r>
+        <w:t>Geocoding new addresses</w:t>
+      </w:r>
+    </w:p>
+    <w:p>
+      <w:pPr>
+        <w:pStyle w:val="ListParagraph"/>
+        <w:numPr>
+          <w:ilvl w:val="0"/>
+          <w:numId w:val="11"/>
+        </w:numPr>
+        <w:spacing w:after="120"/>
+      </w:pPr>
+      <w:r>
+        <w:lastRenderedPageBreak/>
+        <w:t>Generating maps</w:t>
+      </w:r>
+    </w:p>
+    <w:p>
+      <w:pPr>
+        <w:pStyle w:val="ListParagraph"/>
+        <w:numPr>
+          <w:ilvl w:val="0"/>
+          <w:numId w:val="11"/>
+        </w:numPr>
+        <w:spacing w:after="120"/>
+      </w:pPr>
+      <w:r>
+        <w:t>Exporting updated CSVs</w:t>
       </w:r>
     </w:p>
     <w:p>
@@ -257,10 +600,13 @@
     </w:p>
     <w:p>
       <w:pPr>
-        <w:spacing w:after="120"/>
+        <w:rPr>
+          <w:b/>
+          <w:bCs/>
+        </w:rPr>
       </w:pPr>
       <w:r>
-        <w:t>[Typical usage patterns]</w:t>
+        <w:t>(Typical number of properties, expected CSV size, map generation frequency.)</w:t>
       </w:r>
     </w:p>
     <w:p>
@@ -273,10 +619,59 @@
     </w:p>
     <w:p>
       <w:pPr>
+        <w:pStyle w:val="ListParagraph"/>
+        <w:numPr>
+          <w:ilvl w:val="0"/>
+          <w:numId w:val="13"/>
+        </w:numPr>
         <w:spacing w:after="120"/>
+        <w:rPr>
+          <w:color w:val="FF0000"/>
+        </w:rPr>
       </w:pPr>
       <w:r>
-        <w:t>[Procedures, tools, frequency]</w:t>
+        <w:rPr>
+          <w:color w:val="FF0000"/>
+        </w:rPr>
+        <w:t>(Describe the backup CSV created on edits.)</w:t>
+      </w:r>
+    </w:p>
+    <w:p>
+      <w:pPr>
+        <w:pStyle w:val="ListParagraph"/>
+        <w:numPr>
+          <w:ilvl w:val="0"/>
+          <w:numId w:val="13"/>
+        </w:numPr>
+        <w:spacing w:after="120"/>
+        <w:rPr>
+          <w:color w:val="FF0000"/>
+        </w:rPr>
+      </w:pPr>
+      <w:r>
+        <w:rPr>
+          <w:color w:val="FF0000"/>
+        </w:rPr>
+        <w:t>(Explain geocode cache behavior.)</w:t>
+      </w:r>
+    </w:p>
+    <w:p>
+      <w:pPr>
+        <w:pStyle w:val="ListParagraph"/>
+        <w:numPr>
+          <w:ilvl w:val="0"/>
+          <w:numId w:val="13"/>
+        </w:numPr>
+        <w:spacing w:after="120"/>
+        <w:rPr>
+          <w:color w:val="FF0000"/>
+        </w:rPr>
+      </w:pPr>
+      <w:r>
+        <w:rPr>
+          <w:color w:val="FF0000"/>
+        </w:rPr>
+        <w:t>(Note that no automatic saving occurs.)</w:t>
       </w:r>
     </w:p>
     <w:p>
@@ -288,60 +683,78 @@
       </w:r>
     </w:p>
     <w:p>
-      <w:pPr>
-        <w:spacing w:after="120"/>
-      </w:pPr>
       <w:r>
-        <w:t>[Future considerations]</w:t>
+        <w:t>Future Considerations</w:t>
       </w:r>
     </w:p>
     <w:p>
       <w:pPr>
-        <w:spacing w:after="120"/>
+        <w:pStyle w:val="ListParagraph"/>
+        <w:numPr>
+          <w:ilvl w:val="0"/>
+          <w:numId w:val="13"/>
+        </w:numPr>
+        <w:rPr>
+          <w:color w:val="FF0000"/>
+        </w:rPr>
       </w:pPr>
       <w:r>
-        <w:t>[Potential improvements]</w:t>
+        <w:rPr>
+          <w:color w:val="FF0000"/>
+        </w:rPr>
+        <w:t>(Possible enhancements: better error handling, improved UI, more map layers.)</w:t>
       </w:r>
     </w:p>
     <w:p>
-      <w:pPr>
-        <w:spacing w:after="120"/>
-      </w:pPr>
       <w:r>
-        <w:t>[Long-term maintenance notes]</w:t>
+        <w:t>Potential Improvements</w:t>
       </w:r>
     </w:p>
     <w:p>
       <w:pPr>
-        <w:pStyle w:val="Heading1"/>
+        <w:pStyle w:val="ListParagraph"/>
+        <w:numPr>
+          <w:ilvl w:val="0"/>
+          <w:numId w:val="14"/>
+        </w:numPr>
+        <w:rPr>
+          <w:color w:val="FF0000"/>
+        </w:rPr>
       </w:pPr>
       <w:r>
-        <w:t>Appendices (Optional)</w:t>
+        <w:rPr>
+          <w:color w:val="FF0000"/>
+        </w:rPr>
+        <w:t>(Examples: multi‑user support, cloud storage, automated reporting.)</w:t>
       </w:r>
     </w:p>
     <w:p>
-      <w:pPr>
-        <w:spacing w:after="120"/>
-      </w:pPr>
       <w:r>
-        <w:t>[Glossary]</w:t>
+        <w:t>Long‑Term Maintenance Notes</w:t>
       </w:r>
     </w:p>
     <w:p>
       <w:pPr>
-        <w:spacing w:after="120"/>
+        <w:pStyle w:val="ListParagraph"/>
+        <w:numPr>
+          <w:ilvl w:val="0"/>
+          <w:numId w:val="14"/>
+        </w:numPr>
+        <w:rPr>
+          <w:color w:val="FF0000"/>
+        </w:rPr>
       </w:pPr>
       <w:r>
-        <w:t>[Architecture diagrams]</w:t>
+        <w:rPr>
+          <w:color w:val="FF0000"/>
+        </w:rPr>
+        <w:t>(Shapefile updates, tile updates, Python version considerations.)</w:t>
       </w:r>
     </w:p>
     <w:p>
       <w:pPr>
         <w:spacing w:after="120"/>
       </w:pPr>
-      <w:r>
-        <w:t>[Additional notes]</w:t>
-      </w:r>
     </w:p>
     <w:sectPr>
       <w:pgSz w:w="12240" w:h="15840"/>
@@ -523,6 +936,567 @@
       </w:pPr>
       <w:rPr>
         <w:rFonts w:ascii="Symbol" w:hAnsi="Symbol" w:hint="default"/>
+      </w:rPr>
+    </w:lvl>
+  </w:abstractNum>
+  <w:abstractNum w:abstractNumId="9" w15:restartNumberingAfterBreak="0">
+    <w:nsid w:val="13392534"/>
+    <w:multiLevelType w:val="hybridMultilevel"/>
+    <w:tmpl w:val="77C05BFE"/>
+    <w:lvl w:ilvl="0" w:tplc="4A4A907A">
+      <w:numFmt w:val="bullet"/>
+      <w:lvlText w:val="•"/>
+      <w:lvlJc w:val="left"/>
+      <w:pPr>
+        <w:ind w:left="1080" w:hanging="720"/>
+      </w:pPr>
+      <w:rPr>
+        <w:rFonts w:ascii="Cambria" w:eastAsiaTheme="minorEastAsia" w:hAnsi="Cambria" w:cstheme="minorBidi" w:hint="default"/>
+      </w:rPr>
+    </w:lvl>
+    <w:lvl w:ilvl="1" w:tplc="04090003" w:tentative="1">
+      <w:start w:val="1"/>
+      <w:numFmt w:val="bullet"/>
+      <w:lvlText w:val="o"/>
+      <w:lvlJc w:val="left"/>
+      <w:pPr>
+        <w:ind w:left="1440" w:hanging="360"/>
+      </w:pPr>
+      <w:rPr>
+        <w:rFonts w:ascii="Courier New" w:hAnsi="Courier New" w:cs="Courier New" w:hint="default"/>
+      </w:rPr>
+    </w:lvl>
+    <w:lvl w:ilvl="2" w:tplc="04090005" w:tentative="1">
+      <w:start w:val="1"/>
+      <w:numFmt w:val="bullet"/>
+      <w:lvlText w:val=""/>
+      <w:lvlJc w:val="left"/>
+      <w:pPr>
+        <w:ind w:left="2160" w:hanging="360"/>
+      </w:pPr>
+      <w:rPr>
+        <w:rFonts w:ascii="Wingdings" w:hAnsi="Wingdings" w:hint="default"/>
+      </w:rPr>
+    </w:lvl>
+    <w:lvl w:ilvl="3" w:tplc="04090001" w:tentative="1">
+      <w:start w:val="1"/>
+      <w:numFmt w:val="bullet"/>
+      <w:lvlText w:val=""/>
+      <w:lvlJc w:val="left"/>
+      <w:pPr>
+        <w:ind w:left="2880" w:hanging="360"/>
+      </w:pPr>
+      <w:rPr>
+        <w:rFonts w:ascii="Symbol" w:hAnsi="Symbol" w:hint="default"/>
+      </w:rPr>
+    </w:lvl>
+    <w:lvl w:ilvl="4" w:tplc="04090003" w:tentative="1">
+      <w:start w:val="1"/>
+      <w:numFmt w:val="bullet"/>
+      <w:lvlText w:val="o"/>
+      <w:lvlJc w:val="left"/>
+      <w:pPr>
+        <w:ind w:left="3600" w:hanging="360"/>
+      </w:pPr>
+      <w:rPr>
+        <w:rFonts w:ascii="Courier New" w:hAnsi="Courier New" w:cs="Courier New" w:hint="default"/>
+      </w:rPr>
+    </w:lvl>
+    <w:lvl w:ilvl="5" w:tplc="04090005" w:tentative="1">
+      <w:start w:val="1"/>
+      <w:numFmt w:val="bullet"/>
+      <w:lvlText w:val=""/>
+      <w:lvlJc w:val="left"/>
+      <w:pPr>
+        <w:ind w:left="4320" w:hanging="360"/>
+      </w:pPr>
+      <w:rPr>
+        <w:rFonts w:ascii="Wingdings" w:hAnsi="Wingdings" w:hint="default"/>
+      </w:rPr>
+    </w:lvl>
+    <w:lvl w:ilvl="6" w:tplc="04090001" w:tentative="1">
+      <w:start w:val="1"/>
+      <w:numFmt w:val="bullet"/>
+      <w:lvlText w:val=""/>
+      <w:lvlJc w:val="left"/>
+      <w:pPr>
+        <w:ind w:left="5040" w:hanging="360"/>
+      </w:pPr>
+      <w:rPr>
+        <w:rFonts w:ascii="Symbol" w:hAnsi="Symbol" w:hint="default"/>
+      </w:rPr>
+    </w:lvl>
+    <w:lvl w:ilvl="7" w:tplc="04090003" w:tentative="1">
+      <w:start w:val="1"/>
+      <w:numFmt w:val="bullet"/>
+      <w:lvlText w:val="o"/>
+      <w:lvlJc w:val="left"/>
+      <w:pPr>
+        <w:ind w:left="5760" w:hanging="360"/>
+      </w:pPr>
+      <w:rPr>
+        <w:rFonts w:ascii="Courier New" w:hAnsi="Courier New" w:cs="Courier New" w:hint="default"/>
+      </w:rPr>
+    </w:lvl>
+    <w:lvl w:ilvl="8" w:tplc="04090005" w:tentative="1">
+      <w:start w:val="1"/>
+      <w:numFmt w:val="bullet"/>
+      <w:lvlText w:val=""/>
+      <w:lvlJc w:val="left"/>
+      <w:pPr>
+        <w:ind w:left="6480" w:hanging="360"/>
+      </w:pPr>
+      <w:rPr>
+        <w:rFonts w:ascii="Wingdings" w:hAnsi="Wingdings" w:hint="default"/>
+      </w:rPr>
+    </w:lvl>
+  </w:abstractNum>
+  <w:abstractNum w:abstractNumId="10" w15:restartNumberingAfterBreak="0">
+    <w:nsid w:val="17374B47"/>
+    <w:multiLevelType w:val="hybridMultilevel"/>
+    <w:tmpl w:val="2AAA1128"/>
+    <w:lvl w:ilvl="0" w:tplc="4A4A907A">
+      <w:numFmt w:val="bullet"/>
+      <w:lvlText w:val="•"/>
+      <w:lvlJc w:val="left"/>
+      <w:pPr>
+        <w:ind w:left="1080" w:hanging="720"/>
+      </w:pPr>
+      <w:rPr>
+        <w:rFonts w:ascii="Cambria" w:eastAsiaTheme="minorEastAsia" w:hAnsi="Cambria" w:cstheme="minorBidi" w:hint="default"/>
+      </w:rPr>
+    </w:lvl>
+    <w:lvl w:ilvl="1" w:tplc="04090003" w:tentative="1">
+      <w:start w:val="1"/>
+      <w:numFmt w:val="bullet"/>
+      <w:lvlText w:val="o"/>
+      <w:lvlJc w:val="left"/>
+      <w:pPr>
+        <w:ind w:left="1440" w:hanging="360"/>
+      </w:pPr>
+      <w:rPr>
+        <w:rFonts w:ascii="Courier New" w:hAnsi="Courier New" w:cs="Courier New" w:hint="default"/>
+      </w:rPr>
+    </w:lvl>
+    <w:lvl w:ilvl="2" w:tplc="04090005" w:tentative="1">
+      <w:start w:val="1"/>
+      <w:numFmt w:val="bullet"/>
+      <w:lvlText w:val=""/>
+      <w:lvlJc w:val="left"/>
+      <w:pPr>
+        <w:ind w:left="2160" w:hanging="360"/>
+      </w:pPr>
+      <w:rPr>
+        <w:rFonts w:ascii="Wingdings" w:hAnsi="Wingdings" w:hint="default"/>
+      </w:rPr>
+    </w:lvl>
+    <w:lvl w:ilvl="3" w:tplc="04090001" w:tentative="1">
+      <w:start w:val="1"/>
+      <w:numFmt w:val="bullet"/>
+      <w:lvlText w:val=""/>
+      <w:lvlJc w:val="left"/>
+      <w:pPr>
+        <w:ind w:left="2880" w:hanging="360"/>
+      </w:pPr>
+      <w:rPr>
+        <w:rFonts w:ascii="Symbol" w:hAnsi="Symbol" w:hint="default"/>
+      </w:rPr>
+    </w:lvl>
+    <w:lvl w:ilvl="4" w:tplc="04090003" w:tentative="1">
+      <w:start w:val="1"/>
+      <w:numFmt w:val="bullet"/>
+      <w:lvlText w:val="o"/>
+      <w:lvlJc w:val="left"/>
+      <w:pPr>
+        <w:ind w:left="3600" w:hanging="360"/>
+      </w:pPr>
+      <w:rPr>
+        <w:rFonts w:ascii="Courier New" w:hAnsi="Courier New" w:cs="Courier New" w:hint="default"/>
+      </w:rPr>
+    </w:lvl>
+    <w:lvl w:ilvl="5" w:tplc="04090005" w:tentative="1">
+      <w:start w:val="1"/>
+      <w:numFmt w:val="bullet"/>
+      <w:lvlText w:val=""/>
+      <w:lvlJc w:val="left"/>
+      <w:pPr>
+        <w:ind w:left="4320" w:hanging="360"/>
+      </w:pPr>
+      <w:rPr>
+        <w:rFonts w:ascii="Wingdings" w:hAnsi="Wingdings" w:hint="default"/>
+      </w:rPr>
+    </w:lvl>
+    <w:lvl w:ilvl="6" w:tplc="04090001" w:tentative="1">
+      <w:start w:val="1"/>
+      <w:numFmt w:val="bullet"/>
+      <w:lvlText w:val=""/>
+      <w:lvlJc w:val="left"/>
+      <w:pPr>
+        <w:ind w:left="5040" w:hanging="360"/>
+      </w:pPr>
+      <w:rPr>
+        <w:rFonts w:ascii="Symbol" w:hAnsi="Symbol" w:hint="default"/>
+      </w:rPr>
+    </w:lvl>
+    <w:lvl w:ilvl="7" w:tplc="04090003" w:tentative="1">
+      <w:start w:val="1"/>
+      <w:numFmt w:val="bullet"/>
+      <w:lvlText w:val="o"/>
+      <w:lvlJc w:val="left"/>
+      <w:pPr>
+        <w:ind w:left="5760" w:hanging="360"/>
+      </w:pPr>
+      <w:rPr>
+        <w:rFonts w:ascii="Courier New" w:hAnsi="Courier New" w:cs="Courier New" w:hint="default"/>
+      </w:rPr>
+    </w:lvl>
+    <w:lvl w:ilvl="8" w:tplc="04090005" w:tentative="1">
+      <w:start w:val="1"/>
+      <w:numFmt w:val="bullet"/>
+      <w:lvlText w:val=""/>
+      <w:lvlJc w:val="left"/>
+      <w:pPr>
+        <w:ind w:left="6480" w:hanging="360"/>
+      </w:pPr>
+      <w:rPr>
+        <w:rFonts w:ascii="Wingdings" w:hAnsi="Wingdings" w:hint="default"/>
+      </w:rPr>
+    </w:lvl>
+  </w:abstractNum>
+  <w:abstractNum w:abstractNumId="11" w15:restartNumberingAfterBreak="0">
+    <w:nsid w:val="305E349E"/>
+    <w:multiLevelType w:val="hybridMultilevel"/>
+    <w:tmpl w:val="958EE79C"/>
+    <w:lvl w:ilvl="0" w:tplc="04090001">
+      <w:start w:val="1"/>
+      <w:numFmt w:val="bullet"/>
+      <w:lvlText w:val=""/>
+      <w:lvlJc w:val="left"/>
+      <w:pPr>
+        <w:ind w:left="720" w:hanging="360"/>
+      </w:pPr>
+      <w:rPr>
+        <w:rFonts w:ascii="Symbol" w:hAnsi="Symbol" w:hint="default"/>
+      </w:rPr>
+    </w:lvl>
+    <w:lvl w:ilvl="1" w:tplc="04090003" w:tentative="1">
+      <w:start w:val="1"/>
+      <w:numFmt w:val="bullet"/>
+      <w:lvlText w:val="o"/>
+      <w:lvlJc w:val="left"/>
+      <w:pPr>
+        <w:ind w:left="1440" w:hanging="360"/>
+      </w:pPr>
+      <w:rPr>
+        <w:rFonts w:ascii="Courier New" w:hAnsi="Courier New" w:cs="Courier New" w:hint="default"/>
+      </w:rPr>
+    </w:lvl>
+    <w:lvl w:ilvl="2" w:tplc="04090005" w:tentative="1">
+      <w:start w:val="1"/>
+      <w:numFmt w:val="bullet"/>
+      <w:lvlText w:val=""/>
+      <w:lvlJc w:val="left"/>
+      <w:pPr>
+        <w:ind w:left="2160" w:hanging="360"/>
+      </w:pPr>
+      <w:rPr>
+        <w:rFonts w:ascii="Wingdings" w:hAnsi="Wingdings" w:hint="default"/>
+      </w:rPr>
+    </w:lvl>
+    <w:lvl w:ilvl="3" w:tplc="04090001" w:tentative="1">
+      <w:start w:val="1"/>
+      <w:numFmt w:val="bullet"/>
+      <w:lvlText w:val=""/>
+      <w:lvlJc w:val="left"/>
+      <w:pPr>
+        <w:ind w:left="2880" w:hanging="360"/>
+      </w:pPr>
+      <w:rPr>
+        <w:rFonts w:ascii="Symbol" w:hAnsi="Symbol" w:hint="default"/>
+      </w:rPr>
+    </w:lvl>
+    <w:lvl w:ilvl="4" w:tplc="04090003" w:tentative="1">
+      <w:start w:val="1"/>
+      <w:numFmt w:val="bullet"/>
+      <w:lvlText w:val="o"/>
+      <w:lvlJc w:val="left"/>
+      <w:pPr>
+        <w:ind w:left="3600" w:hanging="360"/>
+      </w:pPr>
+      <w:rPr>
+        <w:rFonts w:ascii="Courier New" w:hAnsi="Courier New" w:cs="Courier New" w:hint="default"/>
+      </w:rPr>
+    </w:lvl>
+    <w:lvl w:ilvl="5" w:tplc="04090005" w:tentative="1">
+      <w:start w:val="1"/>
+      <w:numFmt w:val="bullet"/>
+      <w:lvlText w:val=""/>
+      <w:lvlJc w:val="left"/>
+      <w:pPr>
+        <w:ind w:left="4320" w:hanging="360"/>
+      </w:pPr>
+      <w:rPr>
+        <w:rFonts w:ascii="Wingdings" w:hAnsi="Wingdings" w:hint="default"/>
+      </w:rPr>
+    </w:lvl>
+    <w:lvl w:ilvl="6" w:tplc="04090001" w:tentative="1">
+      <w:start w:val="1"/>
+      <w:numFmt w:val="bullet"/>
+      <w:lvlText w:val=""/>
+      <w:lvlJc w:val="left"/>
+      <w:pPr>
+        <w:ind w:left="5040" w:hanging="360"/>
+      </w:pPr>
+      <w:rPr>
+        <w:rFonts w:ascii="Symbol" w:hAnsi="Symbol" w:hint="default"/>
+      </w:rPr>
+    </w:lvl>
+    <w:lvl w:ilvl="7" w:tplc="04090003" w:tentative="1">
+      <w:start w:val="1"/>
+      <w:numFmt w:val="bullet"/>
+      <w:lvlText w:val="o"/>
+      <w:lvlJc w:val="left"/>
+      <w:pPr>
+        <w:ind w:left="5760" w:hanging="360"/>
+      </w:pPr>
+      <w:rPr>
+        <w:rFonts w:ascii="Courier New" w:hAnsi="Courier New" w:cs="Courier New" w:hint="default"/>
+      </w:rPr>
+    </w:lvl>
+    <w:lvl w:ilvl="8" w:tplc="04090005" w:tentative="1">
+      <w:start w:val="1"/>
+      <w:numFmt w:val="bullet"/>
+      <w:lvlText w:val=""/>
+      <w:lvlJc w:val="left"/>
+      <w:pPr>
+        <w:ind w:left="6480" w:hanging="360"/>
+      </w:pPr>
+      <w:rPr>
+        <w:rFonts w:ascii="Wingdings" w:hAnsi="Wingdings" w:hint="default"/>
+      </w:rPr>
+    </w:lvl>
+  </w:abstractNum>
+  <w:abstractNum w:abstractNumId="12" w15:restartNumberingAfterBreak="0">
+    <w:nsid w:val="415A5453"/>
+    <w:multiLevelType w:val="hybridMultilevel"/>
+    <w:tmpl w:val="87B6C46A"/>
+    <w:lvl w:ilvl="0" w:tplc="4A4A907A">
+      <w:numFmt w:val="bullet"/>
+      <w:lvlText w:val="•"/>
+      <w:lvlJc w:val="left"/>
+      <w:pPr>
+        <w:ind w:left="1080" w:hanging="720"/>
+      </w:pPr>
+      <w:rPr>
+        <w:rFonts w:ascii="Cambria" w:eastAsiaTheme="minorEastAsia" w:hAnsi="Cambria" w:cstheme="minorBidi" w:hint="default"/>
+      </w:rPr>
+    </w:lvl>
+    <w:lvl w:ilvl="1" w:tplc="04090003" w:tentative="1">
+      <w:start w:val="1"/>
+      <w:numFmt w:val="bullet"/>
+      <w:lvlText w:val="o"/>
+      <w:lvlJc w:val="left"/>
+      <w:pPr>
+        <w:ind w:left="1440" w:hanging="360"/>
+      </w:pPr>
+      <w:rPr>
+        <w:rFonts w:ascii="Courier New" w:hAnsi="Courier New" w:cs="Courier New" w:hint="default"/>
+      </w:rPr>
+    </w:lvl>
+    <w:lvl w:ilvl="2" w:tplc="04090005" w:tentative="1">
+      <w:start w:val="1"/>
+      <w:numFmt w:val="bullet"/>
+      <w:lvlText w:val=""/>
+      <w:lvlJc w:val="left"/>
+      <w:pPr>
+        <w:ind w:left="2160" w:hanging="360"/>
+      </w:pPr>
+      <w:rPr>
+        <w:rFonts w:ascii="Wingdings" w:hAnsi="Wingdings" w:hint="default"/>
+      </w:rPr>
+    </w:lvl>
+    <w:lvl w:ilvl="3" w:tplc="04090001" w:tentative="1">
+      <w:start w:val="1"/>
+      <w:numFmt w:val="bullet"/>
+      <w:lvlText w:val=""/>
+      <w:lvlJc w:val="left"/>
+      <w:pPr>
+        <w:ind w:left="2880" w:hanging="360"/>
+      </w:pPr>
+      <w:rPr>
+        <w:rFonts w:ascii="Symbol" w:hAnsi="Symbol" w:hint="default"/>
+      </w:rPr>
+    </w:lvl>
+    <w:lvl w:ilvl="4" w:tplc="04090003" w:tentative="1">
+      <w:start w:val="1"/>
+      <w:numFmt w:val="bullet"/>
+      <w:lvlText w:val="o"/>
+      <w:lvlJc w:val="left"/>
+      <w:pPr>
+        <w:ind w:left="3600" w:hanging="360"/>
+      </w:pPr>
+      <w:rPr>
+        <w:rFonts w:ascii="Courier New" w:hAnsi="Courier New" w:cs="Courier New" w:hint="default"/>
+      </w:rPr>
+    </w:lvl>
+    <w:lvl w:ilvl="5" w:tplc="04090005" w:tentative="1">
+      <w:start w:val="1"/>
+      <w:numFmt w:val="bullet"/>
+      <w:lvlText w:val=""/>
+      <w:lvlJc w:val="left"/>
+      <w:pPr>
+        <w:ind w:left="4320" w:hanging="360"/>
+      </w:pPr>
+      <w:rPr>
+        <w:rFonts w:ascii="Wingdings" w:hAnsi="Wingdings" w:hint="default"/>
+      </w:rPr>
+    </w:lvl>
+    <w:lvl w:ilvl="6" w:tplc="04090001" w:tentative="1">
+      <w:start w:val="1"/>
+      <w:numFmt w:val="bullet"/>
+      <w:lvlText w:val=""/>
+      <w:lvlJc w:val="left"/>
+      <w:pPr>
+        <w:ind w:left="5040" w:hanging="360"/>
+      </w:pPr>
+      <w:rPr>
+        <w:rFonts w:ascii="Symbol" w:hAnsi="Symbol" w:hint="default"/>
+      </w:rPr>
+    </w:lvl>
+    <w:lvl w:ilvl="7" w:tplc="04090003" w:tentative="1">
+      <w:start w:val="1"/>
+      <w:numFmt w:val="bullet"/>
+      <w:lvlText w:val="o"/>
+      <w:lvlJc w:val="left"/>
+      <w:pPr>
+        <w:ind w:left="5760" w:hanging="360"/>
+      </w:pPr>
+      <w:rPr>
+        <w:rFonts w:ascii="Courier New" w:hAnsi="Courier New" w:cs="Courier New" w:hint="default"/>
+      </w:rPr>
+    </w:lvl>
+    <w:lvl w:ilvl="8" w:tplc="04090005" w:tentative="1">
+      <w:start w:val="1"/>
+      <w:numFmt w:val="bullet"/>
+      <w:lvlText w:val=""/>
+      <w:lvlJc w:val="left"/>
+      <w:pPr>
+        <w:ind w:left="6480" w:hanging="360"/>
+      </w:pPr>
+      <w:rPr>
+        <w:rFonts w:ascii="Wingdings" w:hAnsi="Wingdings" w:hint="default"/>
+      </w:rPr>
+    </w:lvl>
+  </w:abstractNum>
+  <w:abstractNum w:abstractNumId="13" w15:restartNumberingAfterBreak="0">
+    <w:nsid w:val="77FF3B6F"/>
+    <w:multiLevelType w:val="hybridMultilevel"/>
+    <w:tmpl w:val="7DC201B8"/>
+    <w:lvl w:ilvl="0" w:tplc="4A4A907A">
+      <w:numFmt w:val="bullet"/>
+      <w:lvlText w:val="•"/>
+      <w:lvlJc w:val="left"/>
+      <w:pPr>
+        <w:ind w:left="1080" w:hanging="720"/>
+      </w:pPr>
+      <w:rPr>
+        <w:rFonts w:ascii="Cambria" w:eastAsiaTheme="minorEastAsia" w:hAnsi="Cambria" w:cstheme="minorBidi" w:hint="default"/>
+      </w:rPr>
+    </w:lvl>
+    <w:lvl w:ilvl="1" w:tplc="04090003" w:tentative="1">
+      <w:start w:val="1"/>
+      <w:numFmt w:val="bullet"/>
+      <w:lvlText w:val="o"/>
+      <w:lvlJc w:val="left"/>
+      <w:pPr>
+        <w:ind w:left="1440" w:hanging="360"/>
+      </w:pPr>
+      <w:rPr>
+        <w:rFonts w:ascii="Courier New" w:hAnsi="Courier New" w:cs="Courier New" w:hint="default"/>
+      </w:rPr>
+    </w:lvl>
+    <w:lvl w:ilvl="2" w:tplc="04090005" w:tentative="1">
+      <w:start w:val="1"/>
+      <w:numFmt w:val="bullet"/>
+      <w:lvlText w:val=""/>
+      <w:lvlJc w:val="left"/>
+      <w:pPr>
+        <w:ind w:left="2160" w:hanging="360"/>
+      </w:pPr>
+      <w:rPr>
+        <w:rFonts w:ascii="Wingdings" w:hAnsi="Wingdings" w:hint="default"/>
+      </w:rPr>
+    </w:lvl>
+    <w:lvl w:ilvl="3" w:tplc="04090001" w:tentative="1">
+      <w:start w:val="1"/>
+      <w:numFmt w:val="bullet"/>
+      <w:lvlText w:val=""/>
+      <w:lvlJc w:val="left"/>
+      <w:pPr>
+        <w:ind w:left="2880" w:hanging="360"/>
+      </w:pPr>
+      <w:rPr>
+        <w:rFonts w:ascii="Symbol" w:hAnsi="Symbol" w:hint="default"/>
+      </w:rPr>
+    </w:lvl>
+    <w:lvl w:ilvl="4" w:tplc="04090003" w:tentative="1">
+      <w:start w:val="1"/>
+      <w:numFmt w:val="bullet"/>
+      <w:lvlText w:val="o"/>
+      <w:lvlJc w:val="left"/>
+      <w:pPr>
+        <w:ind w:left="3600" w:hanging="360"/>
+      </w:pPr>
+      <w:rPr>
+        <w:rFonts w:ascii="Courier New" w:hAnsi="Courier New" w:cs="Courier New" w:hint="default"/>
+      </w:rPr>
+    </w:lvl>
+    <w:lvl w:ilvl="5" w:tplc="04090005" w:tentative="1">
+      <w:start w:val="1"/>
+      <w:numFmt w:val="bullet"/>
+      <w:lvlText w:val=""/>
+      <w:lvlJc w:val="left"/>
+      <w:pPr>
+        <w:ind w:left="4320" w:hanging="360"/>
+      </w:pPr>
+      <w:rPr>
+        <w:rFonts w:ascii="Wingdings" w:hAnsi="Wingdings" w:hint="default"/>
+      </w:rPr>
+    </w:lvl>
+    <w:lvl w:ilvl="6" w:tplc="04090001" w:tentative="1">
+      <w:start w:val="1"/>
+      <w:numFmt w:val="bullet"/>
+      <w:lvlText w:val=""/>
+      <w:lvlJc w:val="left"/>
+      <w:pPr>
+        <w:ind w:left="5040" w:hanging="360"/>
+      </w:pPr>
+      <w:rPr>
+        <w:rFonts w:ascii="Symbol" w:hAnsi="Symbol" w:hint="default"/>
+      </w:rPr>
+    </w:lvl>
+    <w:lvl w:ilvl="7" w:tplc="04090003" w:tentative="1">
+      <w:start w:val="1"/>
+      <w:numFmt w:val="bullet"/>
+      <w:lvlText w:val="o"/>
+      <w:lvlJc w:val="left"/>
+      <w:pPr>
+        <w:ind w:left="5760" w:hanging="360"/>
+      </w:pPr>
+      <w:rPr>
+        <w:rFonts w:ascii="Courier New" w:hAnsi="Courier New" w:cs="Courier New" w:hint="default"/>
+      </w:rPr>
+    </w:lvl>
+    <w:lvl w:ilvl="8" w:tplc="04090005" w:tentative="1">
+      <w:start w:val="1"/>
+      <w:numFmt w:val="bullet"/>
+      <w:lvlText w:val=""/>
+      <w:lvlJc w:val="left"/>
+      <w:pPr>
+        <w:ind w:left="6480" w:hanging="360"/>
+      </w:pPr>
+      <w:rPr>
+        <w:rFonts w:ascii="Wingdings" w:hAnsi="Wingdings" w:hint="default"/>
       </w:rPr>
     </w:lvl>
   </w:abstractNum>
@@ -552,6 +1526,21 @@
   </w:num>
   <w:num w:numId="9" w16cid:durableId="44765284">
     <w:abstractNumId w:val="0"/>
+  </w:num>
+  <w:num w:numId="10" w16cid:durableId="1840535909">
+    <w:abstractNumId w:val="11"/>
+  </w:num>
+  <w:num w:numId="11" w16cid:durableId="1728064715">
+    <w:abstractNumId w:val="9"/>
+  </w:num>
+  <w:num w:numId="12" w16cid:durableId="452789931">
+    <w:abstractNumId w:val="13"/>
+  </w:num>
+  <w:num w:numId="13" w16cid:durableId="1530408624">
+    <w:abstractNumId w:val="12"/>
+  </w:num>
+  <w:num w:numId="14" w16cid:durableId="690373826">
+    <w:abstractNumId w:val="10"/>
   </w:num>
 </w:numbering>
 </file>

</xml_diff>